<commit_message>
docs: actualiza documentación técnica y responde hallazgos de TI Revisión 3
CLAUDE.md, README.md, SCHEMA_DB.md y RESUMEN_PROYECTO.md reflejan la
arquitectura hexagonal, el módulo de autenticación y Docker. Genera
Respuesta_Observaciones_Revision_Documental_Verificacion_Final_v3, edita
directamente los 3 documentos oficiales de REVISION 3 (LRS, PTF, DI) y
regenera la Figura 1 del DI con un script versionado (antes no existía
fuente editable). 12 de 13 hallazgos de REVISION 3 quedan resueltos.

Co-Authored-By: Claude Sonnet 5 <noreply@anthropic.com>
</commit_message>
<xml_diff>
--- a/Prompts.docx
+++ b/Prompts.docx
@@ -1080,13 +1080,7 @@
         <w:rPr>
           <w:lang w:val="es-ES_tradnl"/>
         </w:rPr>
-        <w:t xml:space="preserve">. Allí se ingresa con contraseña y tener la opción de iniciar una búsqueda por tu parte </w:t>
-      </w:r>
-      <w:r>
-        <w:rPr>
-          <w:lang w:val="es-ES_tradnl"/>
-        </w:rPr>
-        <w:t xml:space="preserve">en las principales páginas de noticias de vehículos y hacer una </w:t>
+        <w:t xml:space="preserve">. Allí se ingresa con contraseña y tener la opción de iniciar una búsqueda por tu parte en las principales páginas de noticias de vehículos y hacer una </w:t>
       </w:r>
       <w:proofErr w:type="spellStart"/>
       <w:r>
@@ -1100,13 +1094,7 @@
         <w:rPr>
           <w:lang w:val="es-ES_tradnl"/>
         </w:rPr>
-        <w:t xml:space="preserve"> de lanzamientos, para que se la muestres al administrador y sea el administrador quien escoja cuales publicar.</w:t>
-      </w:r>
-      <w:r>
-        <w:rPr>
-          <w:lang w:val="es-ES_tradnl"/>
-        </w:rPr>
-        <w:t xml:space="preserve"> </w:t>
+        <w:t xml:space="preserve"> de lanzamientos, para que se la muestres al administrador y sea el administrador quien escoja cuales publicar. </w:t>
       </w:r>
       <w:r>
         <w:rPr>
@@ -1448,6 +1436,1921 @@
         <w:lastRenderedPageBreak/>
         <w:br/>
       </w:r>
+      <w:r>
+        <w:rPr>
+          <w:lang w:val="es-ES_tradnl"/>
+        </w:rPr>
+        <w:t xml:space="preserve">Entra en modo planeación, vamos a escribir la cotización formal de esta propuesta: </w:t>
+      </w:r>
+      <w:r>
+        <w:rPr>
+          <w:lang w:val="es-ES_tradnl"/>
+        </w:rPr>
+        <w:br/>
+        <w:t>Lo que ellos quieren es desarrollar un nuevo módulo que tenga autenticación de ingreso de los usuarios y de los coordinadores.</w:t>
+      </w:r>
+      <w:r>
+        <w:rPr>
+          <w:lang w:val="es-ES_tradnl"/>
+        </w:rPr>
+        <w:br/>
+        <w:t xml:space="preserve">Para los usuarios admite la solicitud de usuarios nuevos que deben ser aprobados por los coordinadores. Los coordinadores se crean desde la </w:t>
+      </w:r>
+      <w:proofErr w:type="spellStart"/>
+      <w:r>
+        <w:rPr>
+          <w:lang w:val="es-ES_tradnl"/>
+        </w:rPr>
+        <w:t>pagina</w:t>
+      </w:r>
+      <w:proofErr w:type="spellEnd"/>
+      <w:r>
+        <w:rPr>
+          <w:lang w:val="es-ES_tradnl"/>
+        </w:rPr>
+        <w:t xml:space="preserve"> de </w:t>
+      </w:r>
+      <w:proofErr w:type="spellStart"/>
+      <w:r>
+        <w:rPr>
+          <w:lang w:val="es-ES_tradnl"/>
+        </w:rPr>
+        <w:t>admin</w:t>
+      </w:r>
+      <w:proofErr w:type="spellEnd"/>
+      <w:r>
+        <w:rPr>
+          <w:lang w:val="es-ES_tradnl"/>
+        </w:rPr>
+        <w:t>.</w:t>
+      </w:r>
+    </w:p>
+    <w:p>
+      <w:pPr>
+        <w:rPr>
+          <w:lang w:val="es-ES_tradnl"/>
+        </w:rPr>
+      </w:pPr>
+      <w:r>
+        <w:rPr>
+          <w:lang w:val="es-ES_tradnl"/>
+        </w:rPr>
+        <w:t xml:space="preserve">Los coordinadores tienen 3 roles, editar/modificar las fotos subidas por los usuarios, revisar el flujo de documentos de solicitud de participación en el programa de jóvenes </w:t>
+      </w:r>
+      <w:proofErr w:type="spellStart"/>
+      <w:r>
+        <w:rPr>
+          <w:lang w:val="es-ES_tradnl"/>
+        </w:rPr>
+        <w:t>pa</w:t>
+      </w:r>
+      <w:proofErr w:type="spellEnd"/>
+      <w:r>
+        <w:rPr>
+          <w:lang w:val="es-ES_tradnl"/>
+        </w:rPr>
+        <w:t xml:space="preserve"> delante y la visualización de estadísticas y tendencias que vamos a generar a partir de los datos que se ingresen en esta plataforma.</w:t>
+      </w:r>
+      <w:r>
+        <w:rPr>
+          <w:lang w:val="es-ES_tradnl"/>
+        </w:rPr>
+        <w:br/>
+        <w:t>EL perfil de usuario tiene un casillero virtua</w:t>
+      </w:r>
+      <w:r>
+        <w:rPr>
+          <w:lang w:val="es-ES_tradnl"/>
+        </w:rPr>
+        <w:t>l</w:t>
+      </w:r>
+      <w:r>
+        <w:rPr>
+          <w:lang w:val="es-ES_tradnl"/>
+        </w:rPr>
+        <w:t xml:space="preserve"> con una capacidad fija. Allí puede subir las fotos, debemos estimar cuanto debe ser una capacidad adecuada para cada uno, ayúdame. </w:t>
+      </w:r>
+      <w:r>
+        <w:rPr>
+          <w:lang w:val="es-ES_tradnl"/>
+        </w:rPr>
+        <w:br/>
+        <w:t xml:space="preserve">hay un </w:t>
+      </w:r>
+      <w:proofErr w:type="spellStart"/>
+      <w:r>
+        <w:rPr>
+          <w:lang w:val="es-ES_tradnl"/>
+        </w:rPr>
+        <w:t>limite</w:t>
+      </w:r>
+      <w:proofErr w:type="spellEnd"/>
+      <w:r>
+        <w:rPr>
+          <w:lang w:val="es-ES_tradnl"/>
+        </w:rPr>
+        <w:t xml:space="preserve"> mensual de fotos por usuario que también debemos estimar. </w:t>
+      </w:r>
+      <w:r>
+        <w:rPr>
+          <w:lang w:val="es-ES_tradnl"/>
+        </w:rPr>
+        <w:br/>
+        <w:t xml:space="preserve">debe haber un flujo de revisión de documentos: el usuario hace la solicitud para participar en el programa y adjunta los documentos requeridos para dicha participación. Estos documentos deben ser revisados por el coordinador quien aprueba o solicita modificaciones y correcciones sobre los documentos entregados, debe permitir rechazar/devolver documentos de manera individual y no por paquete. </w:t>
+      </w:r>
+      <w:r>
+        <w:rPr>
+          <w:lang w:val="es-ES_tradnl"/>
+        </w:rPr>
+        <w:br/>
+        <w:t xml:space="preserve">el valor es inicial de 65M + 5M/mes. </w:t>
+      </w:r>
+      <w:r>
+        <w:rPr>
+          <w:lang w:val="es-ES_tradnl"/>
+        </w:rPr>
+        <w:br/>
+        <w:t>empecemos, hazme las preguntas que tengas</w:t>
+      </w:r>
+    </w:p>
+    <w:p>
+      <w:pPr>
+        <w:rPr>
+          <w:lang w:val="es-ES_tradnl"/>
+        </w:rPr>
+      </w:pPr>
+    </w:p>
+    <w:p>
+      <w:pPr>
+        <w:rPr>
+          <w:lang w:val="es-ES_tradnl"/>
+        </w:rPr>
+      </w:pPr>
+    </w:p>
+    <w:p>
+      <w:pPr>
+        <w:rPr>
+          <w:lang w:val="es-MX"/>
+        </w:rPr>
+      </w:pPr>
+      <w:r>
+        <w:rPr>
+          <w:lang w:val="es-MX"/>
+        </w:rPr>
+        <w:t>──────────────</w:t>
+      </w:r>
+      <w:r>
+        <w:rPr>
+          <w:rFonts w:ascii="MS Gothic" w:eastAsia="MS Gothic" w:hAnsi="MS Gothic" w:cs="MS Gothic" w:hint="eastAsia"/>
+          <w:lang w:val="es-MX"/>
+        </w:rPr>
+        <w:t>┬</w:t>
+      </w:r>
+      <w:r>
+        <w:rPr>
+          <w:lang w:val="es-MX"/>
+        </w:rPr>
+        <w:t>─────────────────────────</w:t>
+      </w:r>
+      <w:r>
+        <w:rPr>
+          <w:rFonts w:ascii="MS Gothic" w:eastAsia="MS Gothic" w:hAnsi="MS Gothic" w:cs="MS Gothic" w:hint="eastAsia"/>
+          <w:lang w:val="es-MX"/>
+        </w:rPr>
+        <w:t>┬</w:t>
+      </w:r>
+      <w:r>
+        <w:rPr>
+          <w:lang w:val="es-MX"/>
+        </w:rPr>
+        <w:t>────────────────┐</w:t>
+      </w:r>
+    </w:p>
+    <w:p>
+      <w:pPr>
+        <w:rPr>
+          <w:lang w:val="es-MX"/>
+        </w:rPr>
+      </w:pPr>
+      <w:r>
+        <w:rPr>
+          <w:lang w:val="es-MX"/>
+        </w:rPr>
+        <w:t xml:space="preserve">  │     Rol      │         Usuario         │   Contraseña   │</w:t>
+      </w:r>
+    </w:p>
+    <w:p>
+      <w:pPr>
+        <w:rPr>
+          <w:lang w:val="es-MX"/>
+        </w:rPr>
+      </w:pPr>
+      <w:r>
+        <w:rPr>
+          <w:lang w:val="es-MX"/>
+        </w:rPr>
+        <w:t xml:space="preserve">  </w:t>
+      </w:r>
+      <w:r>
+        <w:rPr>
+          <w:rFonts w:ascii="MS Gothic" w:eastAsia="MS Gothic" w:hAnsi="MS Gothic" w:cs="MS Gothic" w:hint="eastAsia"/>
+          <w:lang w:val="es-MX"/>
+        </w:rPr>
+        <w:t>├</w:t>
+      </w:r>
+      <w:r>
+        <w:rPr>
+          <w:lang w:val="es-MX"/>
+        </w:rPr>
+        <w:t>──────────────</w:t>
+      </w:r>
+      <w:r>
+        <w:rPr>
+          <w:rFonts w:ascii="MS Gothic" w:eastAsia="MS Gothic" w:hAnsi="MS Gothic" w:cs="MS Gothic" w:hint="eastAsia"/>
+          <w:lang w:val="es-MX"/>
+        </w:rPr>
+        <w:t>┼</w:t>
+      </w:r>
+      <w:r>
+        <w:rPr>
+          <w:lang w:val="es-MX"/>
+        </w:rPr>
+        <w:t>─────────────────────────</w:t>
+      </w:r>
+      <w:r>
+        <w:rPr>
+          <w:rFonts w:ascii="MS Gothic" w:eastAsia="MS Gothic" w:hAnsi="MS Gothic" w:cs="MS Gothic" w:hint="eastAsia"/>
+          <w:lang w:val="es-MX"/>
+        </w:rPr>
+        <w:t>┼</w:t>
+      </w:r>
+      <w:r>
+        <w:rPr>
+          <w:lang w:val="es-MX"/>
+        </w:rPr>
+        <w:t>────────────────</w:t>
+      </w:r>
+      <w:r>
+        <w:rPr>
+          <w:rFonts w:ascii="MS Gothic" w:eastAsia="MS Gothic" w:hAnsi="MS Gothic" w:cs="MS Gothic" w:hint="eastAsia"/>
+          <w:lang w:val="es-MX"/>
+        </w:rPr>
+        <w:t>┤</w:t>
+      </w:r>
+    </w:p>
+    <w:p>
+      <w:pPr>
+        <w:rPr>
+          <w:lang w:val="es-MX"/>
+        </w:rPr>
+      </w:pPr>
+      <w:r>
+        <w:rPr>
+          <w:lang w:val="es-MX"/>
+        </w:rPr>
+        <w:t xml:space="preserve">  │ Coordinador  │ coordinador@example.com │ coordinador123 │</w:t>
+      </w:r>
+    </w:p>
+    <w:p>
+      <w:pPr>
+        <w:rPr>
+          <w:lang w:val="es-MX"/>
+        </w:rPr>
+      </w:pPr>
+      <w:r>
+        <w:rPr>
+          <w:lang w:val="es-MX"/>
+        </w:rPr>
+        <w:t xml:space="preserve">  </w:t>
+      </w:r>
+      <w:r>
+        <w:rPr>
+          <w:rFonts w:ascii="MS Gothic" w:eastAsia="MS Gothic" w:hAnsi="MS Gothic" w:cs="MS Gothic" w:hint="eastAsia"/>
+          <w:lang w:val="es-MX"/>
+        </w:rPr>
+        <w:t>├</w:t>
+      </w:r>
+      <w:r>
+        <w:rPr>
+          <w:lang w:val="es-MX"/>
+        </w:rPr>
+        <w:t>──────────────</w:t>
+      </w:r>
+      <w:r>
+        <w:rPr>
+          <w:rFonts w:ascii="MS Gothic" w:eastAsia="MS Gothic" w:hAnsi="MS Gothic" w:cs="MS Gothic" w:hint="eastAsia"/>
+          <w:lang w:val="es-MX"/>
+        </w:rPr>
+        <w:t>┼</w:t>
+      </w:r>
+      <w:r>
+        <w:rPr>
+          <w:lang w:val="es-MX"/>
+        </w:rPr>
+        <w:t>─────────────────────────</w:t>
+      </w:r>
+      <w:r>
+        <w:rPr>
+          <w:rFonts w:ascii="MS Gothic" w:eastAsia="MS Gothic" w:hAnsi="MS Gothic" w:cs="MS Gothic" w:hint="eastAsia"/>
+          <w:lang w:val="es-MX"/>
+        </w:rPr>
+        <w:t>┼</w:t>
+      </w:r>
+      <w:r>
+        <w:rPr>
+          <w:lang w:val="es-MX"/>
+        </w:rPr>
+        <w:t>────────────────</w:t>
+      </w:r>
+      <w:r>
+        <w:rPr>
+          <w:rFonts w:ascii="MS Gothic" w:eastAsia="MS Gothic" w:hAnsi="MS Gothic" w:cs="MS Gothic" w:hint="eastAsia"/>
+          <w:lang w:val="es-MX"/>
+        </w:rPr>
+        <w:t>┤</w:t>
+      </w:r>
+    </w:p>
+    <w:p>
+      <w:pPr>
+        <w:rPr>
+          <w:lang w:val="es-MX"/>
+        </w:rPr>
+      </w:pPr>
+      <w:r>
+        <w:rPr>
+          <w:lang w:val="es-MX"/>
+        </w:rPr>
+        <w:t xml:space="preserve">  │ Participante │ documento 1000000001    │ usuario123     │</w:t>
+      </w:r>
+    </w:p>
+    <w:tbl>
+      <w:tblPr>
+        <w:tblStyle w:val="Tablaconcuadrcula"/>
+        <w:tblW w:w="0" w:type="auto"/>
+        <w:tblInd w:w="155" w:type="dxa"/>
+        <w:tblCellMar>
+          <w:left w:w="70" w:type="dxa"/>
+          <w:right w:w="70" w:type="dxa"/>
+        </w:tblCellMar>
+        <w:tblLook w:val="0000" w:firstRow="0" w:lastRow="0" w:firstColumn="0" w:lastColumn="0" w:noHBand="0" w:noVBand="0"/>
+      </w:tblPr>
+      <w:tblGrid>
+        <w:gridCol w:w="1860"/>
+        <w:gridCol w:w="3240"/>
+        <w:gridCol w:w="2100"/>
+      </w:tblGrid>
+      <w:tr>
+        <w:tc>
+          <w:tcPr>
+            <w:tcW w:w="1860" w:type="dxa"/>
+          </w:tcPr>
+          <w:p>
+            <w:pPr>
+              <w:rPr>
+                <w:lang w:val="es-ES_tradnl"/>
+              </w:rPr>
+            </w:pPr>
+          </w:p>
+        </w:tc>
+        <w:tc>
+          <w:tcPr>
+            <w:tcW w:w="3240" w:type="dxa"/>
+          </w:tcPr>
+          <w:p>
+            <w:pPr>
+              <w:rPr>
+                <w:lang w:val="es-ES_tradnl"/>
+              </w:rPr>
+            </w:pPr>
+          </w:p>
+        </w:tc>
+        <w:tc>
+          <w:tcPr>
+            <w:tcW w:w="2100" w:type="dxa"/>
+          </w:tcPr>
+          <w:p>
+            <w:pPr>
+              <w:rPr>
+                <w:lang w:val="es-ES_tradnl"/>
+              </w:rPr>
+            </w:pPr>
+          </w:p>
+        </w:tc>
+      </w:tr>
+    </w:tbl>
+    <w:p>
+      <w:pPr>
+        <w:rPr>
+          <w:lang w:val="es-ES_tradnl"/>
+        </w:rPr>
+      </w:pPr>
+    </w:p>
+    <w:p>
+      <w:pPr>
+        <w:rPr>
+          <w:lang w:val="es-ES_tradnl"/>
+        </w:rPr>
+      </w:pPr>
+    </w:p>
+    <w:p>
+      <w:pPr>
+        <w:rPr>
+          <w:lang w:val="es-ES_tradnl"/>
+        </w:rPr>
+      </w:pPr>
+      <w:r>
+        <w:rPr>
+          <w:lang w:val="es-ES_tradnl"/>
+        </w:rPr>
+        <w:t xml:space="preserve">En el </w:t>
+      </w:r>
+      <w:proofErr w:type="spellStart"/>
+      <w:r>
+        <w:rPr>
+          <w:lang w:val="es-ES_tradnl"/>
+        </w:rPr>
+        <w:t>envio</w:t>
+      </w:r>
+      <w:proofErr w:type="spellEnd"/>
+      <w:r>
+        <w:rPr>
+          <w:lang w:val="es-ES_tradnl"/>
+        </w:rPr>
+        <w:t xml:space="preserve"> de flujo de </w:t>
+      </w:r>
+      <w:proofErr w:type="spellStart"/>
+      <w:r>
+        <w:rPr>
+          <w:lang w:val="es-ES_tradnl"/>
+        </w:rPr>
+        <w:t>envio</w:t>
+      </w:r>
+      <w:proofErr w:type="spellEnd"/>
+      <w:r>
+        <w:rPr>
+          <w:lang w:val="es-ES_tradnl"/>
+        </w:rPr>
+        <w:t xml:space="preserve"> de documentos permite que haya un botón de enviar todo en el usuario para que cuando se le de enviar pueda enviarse una notificación al coordinador</w:t>
+      </w:r>
+      <w:r>
+        <w:rPr>
+          <w:lang w:val="es-ES_tradnl"/>
+        </w:rPr>
+        <w:t xml:space="preserve"> (si se desea implementar luego)</w:t>
+      </w:r>
+      <w:r>
+        <w:rPr>
+          <w:lang w:val="es-ES_tradnl"/>
+        </w:rPr>
+        <w:t xml:space="preserve">. </w:t>
+      </w:r>
+      <w:r>
+        <w:rPr>
+          <w:lang w:val="es-ES_tradnl"/>
+        </w:rPr>
+        <w:br/>
+      </w:r>
+      <w:r>
+        <w:rPr>
+          <w:lang w:val="es-ES_tradnl"/>
+        </w:rPr>
+        <w:t xml:space="preserve">lo ideal es que el usuario sólo haga un envío de todos los documentos, permite un acceso de recuperar contraseña si se olvida. </w:t>
+      </w:r>
+      <w:r>
+        <w:rPr>
+          <w:lang w:val="es-ES_tradnl"/>
+        </w:rPr>
+        <w:br/>
+        <w:t xml:space="preserve">permite que si el usuario puso no aplica, el coordinador pueda editar esto y solicitarle el </w:t>
+      </w:r>
+      <w:proofErr w:type="spellStart"/>
+      <w:r>
+        <w:rPr>
+          <w:lang w:val="es-ES_tradnl"/>
+        </w:rPr>
+        <w:t>docuemnto</w:t>
+      </w:r>
+      <w:proofErr w:type="spellEnd"/>
+    </w:p>
+    <w:p>
+      <w:pPr>
+        <w:rPr>
+          <w:lang w:val="es-ES_tradnl"/>
+        </w:rPr>
+      </w:pPr>
+    </w:p>
+    <w:p>
+      <w:pPr>
+        <w:rPr>
+          <w:lang w:val="es-ES_tradnl"/>
+        </w:rPr>
+      </w:pPr>
+      <w:r>
+        <w:rPr>
+          <w:lang w:val="es-ES_tradnl"/>
+        </w:rPr>
+        <w:t xml:space="preserve">En </w:t>
+      </w:r>
+      <w:r>
+        <w:rPr>
+          <w:lang w:val="es-ES_tradnl"/>
+        </w:rPr>
+        <w:t>Revisión de documentos</w:t>
+      </w:r>
+      <w:r>
+        <w:rPr>
+          <w:lang w:val="es-ES_tradnl"/>
+        </w:rPr>
+        <w:t xml:space="preserve"> y en cuentas pendientes</w:t>
+      </w:r>
+      <w:r>
+        <w:rPr>
+          <w:lang w:val="es-ES_tradnl"/>
+        </w:rPr>
+        <w:t xml:space="preserve"> en el perfil de coordinador permite </w:t>
+      </w:r>
+      <w:r>
+        <w:rPr>
+          <w:lang w:val="es-ES_tradnl"/>
+        </w:rPr>
+        <w:t xml:space="preserve">que el coordinador rechace también el “no aplica” ingresado </w:t>
+      </w:r>
+      <w:proofErr w:type="spellStart"/>
+      <w:r>
+        <w:rPr>
+          <w:lang w:val="es-ES_tradnl"/>
+        </w:rPr>
+        <w:t>popr</w:t>
+      </w:r>
+      <w:proofErr w:type="spellEnd"/>
+      <w:r>
+        <w:rPr>
+          <w:lang w:val="es-ES_tradnl"/>
+        </w:rPr>
+        <w:t xml:space="preserve"> un usuario</w:t>
+      </w:r>
+      <w:r>
+        <w:rPr>
+          <w:lang w:val="es-ES_tradnl"/>
+        </w:rPr>
+        <w:br/>
+        <w:t>en el perfil usuario al ingresar documentos, cuando se carga un documento deshabilita temporalmente el “no aplica en mi caso”</w:t>
+      </w:r>
+    </w:p>
+    <w:p>
+      <w:pPr>
+        <w:rPr>
+          <w:lang w:val="es-ES_tradnl"/>
+        </w:rPr>
+      </w:pPr>
+    </w:p>
+    <w:p>
+      <w:pPr>
+        <w:rPr>
+          <w:lang w:val="es-MX"/>
+        </w:rPr>
+      </w:pPr>
+      <w:r>
+        <w:rPr>
+          <w:lang w:val="es-MX"/>
+        </w:rPr>
+        <w:t xml:space="preserve">       Nombre         │ Documento (usuario de login) │  Estado   │          Origen           │</w:t>
+      </w:r>
+    </w:p>
+    <w:p>
+      <w:pPr>
+        <w:rPr>
+          <w:lang w:val="es-MX"/>
+        </w:rPr>
+      </w:pPr>
+      <w:r>
+        <w:rPr>
+          <w:lang w:val="es-MX"/>
+        </w:rPr>
+        <w:t xml:space="preserve">  </w:t>
+      </w:r>
+      <w:r>
+        <w:rPr>
+          <w:rFonts w:ascii="MS Gothic" w:eastAsia="MS Gothic" w:hAnsi="MS Gothic" w:cs="MS Gothic" w:hint="eastAsia"/>
+          <w:lang w:val="es-MX"/>
+        </w:rPr>
+        <w:t>├</w:t>
+      </w:r>
+      <w:r>
+        <w:rPr>
+          <w:lang w:val="es-MX"/>
+        </w:rPr>
+        <w:t>────────────────────────</w:t>
+      </w:r>
+      <w:r>
+        <w:rPr>
+          <w:rFonts w:ascii="MS Gothic" w:eastAsia="MS Gothic" w:hAnsi="MS Gothic" w:cs="MS Gothic" w:hint="eastAsia"/>
+          <w:lang w:val="es-MX"/>
+        </w:rPr>
+        <w:t>┼</w:t>
+      </w:r>
+      <w:r>
+        <w:rPr>
+          <w:lang w:val="es-MX"/>
+        </w:rPr>
+        <w:t>──────────────────────────────</w:t>
+      </w:r>
+      <w:r>
+        <w:rPr>
+          <w:rFonts w:ascii="MS Gothic" w:eastAsia="MS Gothic" w:hAnsi="MS Gothic" w:cs="MS Gothic" w:hint="eastAsia"/>
+          <w:lang w:val="es-MX"/>
+        </w:rPr>
+        <w:t>┼</w:t>
+      </w:r>
+      <w:r>
+        <w:rPr>
+          <w:lang w:val="es-MX"/>
+        </w:rPr>
+        <w:t>───────────</w:t>
+      </w:r>
+      <w:r>
+        <w:rPr>
+          <w:rFonts w:ascii="MS Gothic" w:eastAsia="MS Gothic" w:hAnsi="MS Gothic" w:cs="MS Gothic" w:hint="eastAsia"/>
+          <w:lang w:val="es-MX"/>
+        </w:rPr>
+        <w:t>┼</w:t>
+      </w:r>
+      <w:r>
+        <w:rPr>
+          <w:lang w:val="es-MX"/>
+        </w:rPr>
+        <w:t>───────────────────────────</w:t>
+      </w:r>
+      <w:r>
+        <w:rPr>
+          <w:rFonts w:ascii="MS Gothic" w:eastAsia="MS Gothic" w:hAnsi="MS Gothic" w:cs="MS Gothic" w:hint="eastAsia"/>
+          <w:lang w:val="es-MX"/>
+        </w:rPr>
+        <w:t>┤</w:t>
+      </w:r>
+    </w:p>
+    <w:p>
+      <w:pPr>
+        <w:rPr>
+          <w:lang w:val="es-MX"/>
+        </w:rPr>
+      </w:pPr>
+      <w:r>
+        <w:rPr>
+          <w:lang w:val="es-MX"/>
+        </w:rPr>
+        <w:t xml:space="preserve">  │ Sebastian              │ 8027014                      │ aprobada  │ Tu cuenta real de pruebas │</w:t>
+      </w:r>
+    </w:p>
+    <w:p>
+      <w:pPr>
+        <w:rPr>
+          <w:lang w:val="es-MX"/>
+        </w:rPr>
+      </w:pPr>
+      <w:r>
+        <w:rPr>
+          <w:lang w:val="es-MX"/>
+        </w:rPr>
+        <w:t xml:space="preserve">  </w:t>
+      </w:r>
+      <w:r>
+        <w:rPr>
+          <w:rFonts w:ascii="MS Gothic" w:eastAsia="MS Gothic" w:hAnsi="MS Gothic" w:cs="MS Gothic" w:hint="eastAsia"/>
+          <w:lang w:val="es-MX"/>
+        </w:rPr>
+        <w:t>├</w:t>
+      </w:r>
+      <w:r>
+        <w:rPr>
+          <w:lang w:val="es-MX"/>
+        </w:rPr>
+        <w:t>────────────────────────</w:t>
+      </w:r>
+      <w:r>
+        <w:rPr>
+          <w:rFonts w:ascii="MS Gothic" w:eastAsia="MS Gothic" w:hAnsi="MS Gothic" w:cs="MS Gothic" w:hint="eastAsia"/>
+          <w:lang w:val="es-MX"/>
+        </w:rPr>
+        <w:t>┼</w:t>
+      </w:r>
+      <w:r>
+        <w:rPr>
+          <w:lang w:val="es-MX"/>
+        </w:rPr>
+        <w:t>──────────────────────────────</w:t>
+      </w:r>
+      <w:r>
+        <w:rPr>
+          <w:rFonts w:ascii="MS Gothic" w:eastAsia="MS Gothic" w:hAnsi="MS Gothic" w:cs="MS Gothic" w:hint="eastAsia"/>
+          <w:lang w:val="es-MX"/>
+        </w:rPr>
+        <w:t>┼</w:t>
+      </w:r>
+      <w:r>
+        <w:rPr>
+          <w:lang w:val="es-MX"/>
+        </w:rPr>
+        <w:t>───────────</w:t>
+      </w:r>
+      <w:r>
+        <w:rPr>
+          <w:rFonts w:ascii="MS Gothic" w:eastAsia="MS Gothic" w:hAnsi="MS Gothic" w:cs="MS Gothic" w:hint="eastAsia"/>
+          <w:lang w:val="es-MX"/>
+        </w:rPr>
+        <w:t>┼</w:t>
+      </w:r>
+      <w:r>
+        <w:rPr>
+          <w:lang w:val="es-MX"/>
+        </w:rPr>
+        <w:t>───────────────────────────</w:t>
+      </w:r>
+      <w:r>
+        <w:rPr>
+          <w:rFonts w:ascii="MS Gothic" w:eastAsia="MS Gothic" w:hAnsi="MS Gothic" w:cs="MS Gothic" w:hint="eastAsia"/>
+          <w:lang w:val="es-MX"/>
+        </w:rPr>
+        <w:t>┤</w:t>
+      </w:r>
+    </w:p>
+    <w:p>
+      <w:pPr>
+        <w:rPr>
+          <w:lang w:val="es-MX"/>
+        </w:rPr>
+      </w:pPr>
+      <w:r>
+        <w:rPr>
+          <w:lang w:val="es-MX"/>
+        </w:rPr>
+        <w:t xml:space="preserve">  │ Sebastian Florez Marin │ INAT-10174481                │ aprobada  │ Migrado iNaturalist       │</w:t>
+      </w:r>
+    </w:p>
+    <w:p>
+      <w:pPr>
+        <w:rPr>
+          <w:lang w:val="es-MX"/>
+        </w:rPr>
+      </w:pPr>
+      <w:r>
+        <w:rPr>
+          <w:lang w:val="es-MX"/>
+        </w:rPr>
+        <w:t xml:space="preserve">  </w:t>
+      </w:r>
+      <w:r>
+        <w:rPr>
+          <w:rFonts w:ascii="MS Gothic" w:eastAsia="MS Gothic" w:hAnsi="MS Gothic" w:cs="MS Gothic" w:hint="eastAsia"/>
+          <w:lang w:val="es-MX"/>
+        </w:rPr>
+        <w:t>├</w:t>
+      </w:r>
+      <w:r>
+        <w:rPr>
+          <w:lang w:val="es-MX"/>
+        </w:rPr>
+        <w:t>────────────────────────</w:t>
+      </w:r>
+      <w:r>
+        <w:rPr>
+          <w:rFonts w:ascii="MS Gothic" w:eastAsia="MS Gothic" w:hAnsi="MS Gothic" w:cs="MS Gothic" w:hint="eastAsia"/>
+          <w:lang w:val="es-MX"/>
+        </w:rPr>
+        <w:t>┼</w:t>
+      </w:r>
+      <w:r>
+        <w:rPr>
+          <w:lang w:val="es-MX"/>
+        </w:rPr>
+        <w:t>──────────────────────────────</w:t>
+      </w:r>
+      <w:r>
+        <w:rPr>
+          <w:rFonts w:ascii="MS Gothic" w:eastAsia="MS Gothic" w:hAnsi="MS Gothic" w:cs="MS Gothic" w:hint="eastAsia"/>
+          <w:lang w:val="es-MX"/>
+        </w:rPr>
+        <w:t>┼</w:t>
+      </w:r>
+      <w:r>
+        <w:rPr>
+          <w:lang w:val="es-MX"/>
+        </w:rPr>
+        <w:t>───────────</w:t>
+      </w:r>
+      <w:r>
+        <w:rPr>
+          <w:rFonts w:ascii="MS Gothic" w:eastAsia="MS Gothic" w:hAnsi="MS Gothic" w:cs="MS Gothic" w:hint="eastAsia"/>
+          <w:lang w:val="es-MX"/>
+        </w:rPr>
+        <w:t>┼</w:t>
+      </w:r>
+      <w:r>
+        <w:rPr>
+          <w:lang w:val="es-MX"/>
+        </w:rPr>
+        <w:t>───────────────────────────</w:t>
+      </w:r>
+      <w:r>
+        <w:rPr>
+          <w:rFonts w:ascii="MS Gothic" w:eastAsia="MS Gothic" w:hAnsi="MS Gothic" w:cs="MS Gothic" w:hint="eastAsia"/>
+          <w:lang w:val="es-MX"/>
+        </w:rPr>
+        <w:t>┤</w:t>
+      </w:r>
+    </w:p>
+    <w:p>
+      <w:pPr>
+        <w:rPr>
+          <w:lang w:val="es-MX"/>
+        </w:rPr>
+      </w:pPr>
+      <w:r>
+        <w:rPr>
+          <w:lang w:val="es-MX"/>
+        </w:rPr>
+        <w:t xml:space="preserve">  │ Antonio Florez Guzman  │ INAT-10112617                │ aprobada  │ Migrado iNaturalist       │</w:t>
+      </w:r>
+    </w:p>
+    <w:p>
+      <w:pPr>
+        <w:rPr>
+          <w:lang w:val="es-MX"/>
+        </w:rPr>
+      </w:pPr>
+      <w:r>
+        <w:rPr>
+          <w:lang w:val="es-MX"/>
+        </w:rPr>
+        <w:t xml:space="preserve">  </w:t>
+      </w:r>
+      <w:r>
+        <w:rPr>
+          <w:rFonts w:ascii="MS Gothic" w:eastAsia="MS Gothic" w:hAnsi="MS Gothic" w:cs="MS Gothic" w:hint="eastAsia"/>
+          <w:lang w:val="es-MX"/>
+        </w:rPr>
+        <w:t>├</w:t>
+      </w:r>
+      <w:r>
+        <w:rPr>
+          <w:lang w:val="es-MX"/>
+        </w:rPr>
+        <w:t>────────────────────────</w:t>
+      </w:r>
+      <w:r>
+        <w:rPr>
+          <w:rFonts w:ascii="MS Gothic" w:eastAsia="MS Gothic" w:hAnsi="MS Gothic" w:cs="MS Gothic" w:hint="eastAsia"/>
+          <w:lang w:val="es-MX"/>
+        </w:rPr>
+        <w:t>┼</w:t>
+      </w:r>
+      <w:r>
+        <w:rPr>
+          <w:lang w:val="es-MX"/>
+        </w:rPr>
+        <w:t>──────────────────────────────</w:t>
+      </w:r>
+      <w:r>
+        <w:rPr>
+          <w:rFonts w:ascii="MS Gothic" w:eastAsia="MS Gothic" w:hAnsi="MS Gothic" w:cs="MS Gothic" w:hint="eastAsia"/>
+          <w:lang w:val="es-MX"/>
+        </w:rPr>
+        <w:t>┼</w:t>
+      </w:r>
+      <w:r>
+        <w:rPr>
+          <w:lang w:val="es-MX"/>
+        </w:rPr>
+        <w:t>───────────</w:t>
+      </w:r>
+      <w:r>
+        <w:rPr>
+          <w:rFonts w:ascii="MS Gothic" w:eastAsia="MS Gothic" w:hAnsi="MS Gothic" w:cs="MS Gothic" w:hint="eastAsia"/>
+          <w:lang w:val="es-MX"/>
+        </w:rPr>
+        <w:t>┼</w:t>
+      </w:r>
+      <w:r>
+        <w:rPr>
+          <w:lang w:val="es-MX"/>
+        </w:rPr>
+        <w:t>───────────────────────────</w:t>
+      </w:r>
+      <w:r>
+        <w:rPr>
+          <w:rFonts w:ascii="MS Gothic" w:eastAsia="MS Gothic" w:hAnsi="MS Gothic" w:cs="MS Gothic" w:hint="eastAsia"/>
+          <w:lang w:val="es-MX"/>
+        </w:rPr>
+        <w:t>┤</w:t>
+      </w:r>
+    </w:p>
+    <w:p>
+      <w:pPr>
+        <w:rPr>
+          <w:lang w:val="es-MX"/>
+        </w:rPr>
+      </w:pPr>
+      <w:r>
+        <w:rPr>
+          <w:lang w:val="es-MX"/>
+        </w:rPr>
+        <w:t xml:space="preserve">  │ Juberlys Renteria      │ INAT-10122963                │ aprobada  │ Migrado iNaturalist       │</w:t>
+      </w:r>
+    </w:p>
+    <w:p>
+      <w:pPr>
+        <w:rPr>
+          <w:lang w:val="es-MX"/>
+        </w:rPr>
+      </w:pPr>
+      <w:r>
+        <w:rPr>
+          <w:lang w:val="es-MX"/>
+        </w:rPr>
+        <w:t xml:space="preserve">  </w:t>
+      </w:r>
+      <w:r>
+        <w:rPr>
+          <w:rFonts w:ascii="MS Gothic" w:eastAsia="MS Gothic" w:hAnsi="MS Gothic" w:cs="MS Gothic" w:hint="eastAsia"/>
+          <w:lang w:val="es-MX"/>
+        </w:rPr>
+        <w:t>├</w:t>
+      </w:r>
+      <w:r>
+        <w:rPr>
+          <w:lang w:val="es-MX"/>
+        </w:rPr>
+        <w:t>────────────────────────</w:t>
+      </w:r>
+      <w:r>
+        <w:rPr>
+          <w:rFonts w:ascii="MS Gothic" w:eastAsia="MS Gothic" w:hAnsi="MS Gothic" w:cs="MS Gothic" w:hint="eastAsia"/>
+          <w:lang w:val="es-MX"/>
+        </w:rPr>
+        <w:t>┼</w:t>
+      </w:r>
+      <w:r>
+        <w:rPr>
+          <w:lang w:val="es-MX"/>
+        </w:rPr>
+        <w:t>──────────────────────────────</w:t>
+      </w:r>
+      <w:r>
+        <w:rPr>
+          <w:rFonts w:ascii="MS Gothic" w:eastAsia="MS Gothic" w:hAnsi="MS Gothic" w:cs="MS Gothic" w:hint="eastAsia"/>
+          <w:lang w:val="es-MX"/>
+        </w:rPr>
+        <w:t>┼</w:t>
+      </w:r>
+      <w:r>
+        <w:rPr>
+          <w:lang w:val="es-MX"/>
+        </w:rPr>
+        <w:t>───────────</w:t>
+      </w:r>
+      <w:r>
+        <w:rPr>
+          <w:rFonts w:ascii="MS Gothic" w:eastAsia="MS Gothic" w:hAnsi="MS Gothic" w:cs="MS Gothic" w:hint="eastAsia"/>
+          <w:lang w:val="es-MX"/>
+        </w:rPr>
+        <w:t>┼</w:t>
+      </w:r>
+      <w:r>
+        <w:rPr>
+          <w:lang w:val="es-MX"/>
+        </w:rPr>
+        <w:t>───────────────────────────</w:t>
+      </w:r>
+      <w:r>
+        <w:rPr>
+          <w:rFonts w:ascii="MS Gothic" w:eastAsia="MS Gothic" w:hAnsi="MS Gothic" w:cs="MS Gothic" w:hint="eastAsia"/>
+          <w:lang w:val="es-MX"/>
+        </w:rPr>
+        <w:t>┤</w:t>
+      </w:r>
+    </w:p>
+    <w:p>
+      <w:pPr>
+        <w:rPr>
+          <w:lang w:val="es-MX"/>
+        </w:rPr>
+      </w:pPr>
+      <w:r>
+        <w:rPr>
+          <w:lang w:val="es-MX"/>
+        </w:rPr>
+        <w:t xml:space="preserve">  │ Karol Poveda           │ INAT-10116995                │ aprobada  │ Migrado iNaturalist       │</w:t>
+      </w:r>
+    </w:p>
+    <w:p>
+      <w:pPr>
+        <w:rPr>
+          <w:lang w:val="es-MX"/>
+        </w:rPr>
+      </w:pPr>
+      <w:r>
+        <w:rPr>
+          <w:lang w:val="es-MX"/>
+        </w:rPr>
+        <w:t xml:space="preserve">  </w:t>
+      </w:r>
+      <w:r>
+        <w:rPr>
+          <w:rFonts w:ascii="MS Gothic" w:eastAsia="MS Gothic" w:hAnsi="MS Gothic" w:cs="MS Gothic" w:hint="eastAsia"/>
+          <w:lang w:val="es-MX"/>
+        </w:rPr>
+        <w:t>├</w:t>
+      </w:r>
+      <w:r>
+        <w:rPr>
+          <w:lang w:val="es-MX"/>
+        </w:rPr>
+        <w:t>────────────────────────</w:t>
+      </w:r>
+      <w:r>
+        <w:rPr>
+          <w:rFonts w:ascii="MS Gothic" w:eastAsia="MS Gothic" w:hAnsi="MS Gothic" w:cs="MS Gothic" w:hint="eastAsia"/>
+          <w:lang w:val="es-MX"/>
+        </w:rPr>
+        <w:t>┼</w:t>
+      </w:r>
+      <w:r>
+        <w:rPr>
+          <w:lang w:val="es-MX"/>
+        </w:rPr>
+        <w:t>──────────────────────────────</w:t>
+      </w:r>
+      <w:r>
+        <w:rPr>
+          <w:rFonts w:ascii="MS Gothic" w:eastAsia="MS Gothic" w:hAnsi="MS Gothic" w:cs="MS Gothic" w:hint="eastAsia"/>
+          <w:lang w:val="es-MX"/>
+        </w:rPr>
+        <w:t>┼</w:t>
+      </w:r>
+      <w:r>
+        <w:rPr>
+          <w:lang w:val="es-MX"/>
+        </w:rPr>
+        <w:t>───────────</w:t>
+      </w:r>
+      <w:r>
+        <w:rPr>
+          <w:rFonts w:ascii="MS Gothic" w:eastAsia="MS Gothic" w:hAnsi="MS Gothic" w:cs="MS Gothic" w:hint="eastAsia"/>
+          <w:lang w:val="es-MX"/>
+        </w:rPr>
+        <w:t>┼</w:t>
+      </w:r>
+      <w:r>
+        <w:rPr>
+          <w:lang w:val="es-MX"/>
+        </w:rPr>
+        <w:t>───────────────────────────</w:t>
+      </w:r>
+      <w:r>
+        <w:rPr>
+          <w:rFonts w:ascii="MS Gothic" w:eastAsia="MS Gothic" w:hAnsi="MS Gothic" w:cs="MS Gothic" w:hint="eastAsia"/>
+          <w:lang w:val="es-MX"/>
+        </w:rPr>
+        <w:t>┤</w:t>
+      </w:r>
+    </w:p>
+    <w:p>
+      <w:pPr>
+        <w:rPr>
+          <w:lang w:val="es-MX"/>
+        </w:rPr>
+      </w:pPr>
+      <w:r>
+        <w:rPr>
+          <w:lang w:val="es-MX"/>
+        </w:rPr>
+        <w:t xml:space="preserve">  │ Xiomara Ríos Guarín    │ INAT-10090050                │ aprobada  │ Migrado iNaturalist       │</w:t>
+      </w:r>
+    </w:p>
+    <w:p>
+      <w:pPr>
+        <w:rPr>
+          <w:lang w:val="es-MX"/>
+        </w:rPr>
+      </w:pPr>
+      <w:r>
+        <w:rPr>
+          <w:lang w:val="es-MX"/>
+        </w:rPr>
+        <w:t xml:space="preserve">  </w:t>
+      </w:r>
+      <w:r>
+        <w:rPr>
+          <w:rFonts w:ascii="MS Gothic" w:eastAsia="MS Gothic" w:hAnsi="MS Gothic" w:cs="MS Gothic" w:hint="eastAsia"/>
+          <w:lang w:val="es-MX"/>
+        </w:rPr>
+        <w:t>├</w:t>
+      </w:r>
+      <w:r>
+        <w:rPr>
+          <w:lang w:val="es-MX"/>
+        </w:rPr>
+        <w:t>────────────────────────</w:t>
+      </w:r>
+      <w:r>
+        <w:rPr>
+          <w:rFonts w:ascii="MS Gothic" w:eastAsia="MS Gothic" w:hAnsi="MS Gothic" w:cs="MS Gothic" w:hint="eastAsia"/>
+          <w:lang w:val="es-MX"/>
+        </w:rPr>
+        <w:t>┼</w:t>
+      </w:r>
+      <w:r>
+        <w:rPr>
+          <w:lang w:val="es-MX"/>
+        </w:rPr>
+        <w:t>──────────────────────────────</w:t>
+      </w:r>
+      <w:r>
+        <w:rPr>
+          <w:rFonts w:ascii="MS Gothic" w:eastAsia="MS Gothic" w:hAnsi="MS Gothic" w:cs="MS Gothic" w:hint="eastAsia"/>
+          <w:lang w:val="es-MX"/>
+        </w:rPr>
+        <w:t>┼</w:t>
+      </w:r>
+      <w:r>
+        <w:rPr>
+          <w:lang w:val="es-MX"/>
+        </w:rPr>
+        <w:t>───────────</w:t>
+      </w:r>
+      <w:r>
+        <w:rPr>
+          <w:rFonts w:ascii="MS Gothic" w:eastAsia="MS Gothic" w:hAnsi="MS Gothic" w:cs="MS Gothic" w:hint="eastAsia"/>
+          <w:lang w:val="es-MX"/>
+        </w:rPr>
+        <w:t>┼</w:t>
+      </w:r>
+      <w:r>
+        <w:rPr>
+          <w:lang w:val="es-MX"/>
+        </w:rPr>
+        <w:t>───────────────────────────</w:t>
+      </w:r>
+      <w:r>
+        <w:rPr>
+          <w:rFonts w:ascii="MS Gothic" w:eastAsia="MS Gothic" w:hAnsi="MS Gothic" w:cs="MS Gothic" w:hint="eastAsia"/>
+          <w:lang w:val="es-MX"/>
+        </w:rPr>
+        <w:t>┤</w:t>
+      </w:r>
+    </w:p>
+    <w:p>
+      <w:pPr>
+        <w:rPr>
+          <w:lang w:val="es-MX"/>
+        </w:rPr>
+      </w:pPr>
+      <w:r>
+        <w:rPr>
+          <w:lang w:val="es-MX"/>
+        </w:rPr>
+        <w:t xml:space="preserve">  │ Luisa Ramoz            │ INAT-10047984                │ aprobada  │ Migrado iNaturalist       │</w:t>
+      </w:r>
+    </w:p>
+    <w:p>
+      <w:pPr>
+        <w:rPr>
+          <w:lang w:val="es-MX"/>
+        </w:rPr>
+      </w:pPr>
+      <w:r>
+        <w:rPr>
+          <w:lang w:val="es-MX"/>
+        </w:rPr>
+        <w:t xml:space="preserve">  </w:t>
+      </w:r>
+      <w:r>
+        <w:rPr>
+          <w:rFonts w:ascii="MS Gothic" w:eastAsia="MS Gothic" w:hAnsi="MS Gothic" w:cs="MS Gothic" w:hint="eastAsia"/>
+          <w:lang w:val="es-MX"/>
+        </w:rPr>
+        <w:t>├</w:t>
+      </w:r>
+      <w:r>
+        <w:rPr>
+          <w:lang w:val="es-MX"/>
+        </w:rPr>
+        <w:t>────────────────────────</w:t>
+      </w:r>
+      <w:r>
+        <w:rPr>
+          <w:rFonts w:ascii="MS Gothic" w:eastAsia="MS Gothic" w:hAnsi="MS Gothic" w:cs="MS Gothic" w:hint="eastAsia"/>
+          <w:lang w:val="es-MX"/>
+        </w:rPr>
+        <w:t>┼</w:t>
+      </w:r>
+      <w:r>
+        <w:rPr>
+          <w:lang w:val="es-MX"/>
+        </w:rPr>
+        <w:t>──────────────────────────────</w:t>
+      </w:r>
+      <w:r>
+        <w:rPr>
+          <w:rFonts w:ascii="MS Gothic" w:eastAsia="MS Gothic" w:hAnsi="MS Gothic" w:cs="MS Gothic" w:hint="eastAsia"/>
+          <w:lang w:val="es-MX"/>
+        </w:rPr>
+        <w:t>┼</w:t>
+      </w:r>
+      <w:r>
+        <w:rPr>
+          <w:lang w:val="es-MX"/>
+        </w:rPr>
+        <w:t>───────────</w:t>
+      </w:r>
+      <w:r>
+        <w:rPr>
+          <w:rFonts w:ascii="MS Gothic" w:eastAsia="MS Gothic" w:hAnsi="MS Gothic" w:cs="MS Gothic" w:hint="eastAsia"/>
+          <w:lang w:val="es-MX"/>
+        </w:rPr>
+        <w:t>┼</w:t>
+      </w:r>
+      <w:r>
+        <w:rPr>
+          <w:lang w:val="es-MX"/>
+        </w:rPr>
+        <w:t>───────────────────────────</w:t>
+      </w:r>
+      <w:r>
+        <w:rPr>
+          <w:rFonts w:ascii="MS Gothic" w:eastAsia="MS Gothic" w:hAnsi="MS Gothic" w:cs="MS Gothic" w:hint="eastAsia"/>
+          <w:lang w:val="es-MX"/>
+        </w:rPr>
+        <w:t>┤</w:t>
+      </w:r>
+    </w:p>
+    <w:p>
+      <w:pPr>
+        <w:rPr>
+          <w:lang w:val="es-MX"/>
+        </w:rPr>
+      </w:pPr>
+      <w:r>
+        <w:rPr>
+          <w:lang w:val="es-MX"/>
+        </w:rPr>
+        <w:t xml:space="preserve">  │ Kevin Guisao           │ INAT-10161618                │ aprobada  │ Migrado iNaturalist       │</w:t>
+      </w:r>
+    </w:p>
+    <w:p>
+      <w:pPr>
+        <w:rPr>
+          <w:lang w:val="es-MX"/>
+        </w:rPr>
+      </w:pPr>
+      <w:r>
+        <w:rPr>
+          <w:lang w:val="es-MX"/>
+        </w:rPr>
+        <w:t xml:space="preserve">  </w:t>
+      </w:r>
+      <w:r>
+        <w:rPr>
+          <w:rFonts w:ascii="MS Gothic" w:eastAsia="MS Gothic" w:hAnsi="MS Gothic" w:cs="MS Gothic" w:hint="eastAsia"/>
+          <w:lang w:val="es-MX"/>
+        </w:rPr>
+        <w:t>├</w:t>
+      </w:r>
+      <w:r>
+        <w:rPr>
+          <w:lang w:val="es-MX"/>
+        </w:rPr>
+        <w:t>────────────────────────</w:t>
+      </w:r>
+      <w:r>
+        <w:rPr>
+          <w:rFonts w:ascii="MS Gothic" w:eastAsia="MS Gothic" w:hAnsi="MS Gothic" w:cs="MS Gothic" w:hint="eastAsia"/>
+          <w:lang w:val="es-MX"/>
+        </w:rPr>
+        <w:t>┼</w:t>
+      </w:r>
+      <w:r>
+        <w:rPr>
+          <w:lang w:val="es-MX"/>
+        </w:rPr>
+        <w:t>──────────────────────────────</w:t>
+      </w:r>
+      <w:r>
+        <w:rPr>
+          <w:rFonts w:ascii="MS Gothic" w:eastAsia="MS Gothic" w:hAnsi="MS Gothic" w:cs="MS Gothic" w:hint="eastAsia"/>
+          <w:lang w:val="es-MX"/>
+        </w:rPr>
+        <w:t>┼</w:t>
+      </w:r>
+      <w:r>
+        <w:rPr>
+          <w:lang w:val="es-MX"/>
+        </w:rPr>
+        <w:t>───────────</w:t>
+      </w:r>
+      <w:r>
+        <w:rPr>
+          <w:rFonts w:ascii="MS Gothic" w:eastAsia="MS Gothic" w:hAnsi="MS Gothic" w:cs="MS Gothic" w:hint="eastAsia"/>
+          <w:lang w:val="es-MX"/>
+        </w:rPr>
+        <w:t>┼</w:t>
+      </w:r>
+      <w:r>
+        <w:rPr>
+          <w:lang w:val="es-MX"/>
+        </w:rPr>
+        <w:t>───────────────────────────</w:t>
+      </w:r>
+      <w:r>
+        <w:rPr>
+          <w:rFonts w:ascii="MS Gothic" w:eastAsia="MS Gothic" w:hAnsi="MS Gothic" w:cs="MS Gothic" w:hint="eastAsia"/>
+          <w:lang w:val="es-MX"/>
+        </w:rPr>
+        <w:t>┤</w:t>
+      </w:r>
+    </w:p>
+    <w:p>
+      <w:pPr>
+        <w:rPr>
+          <w:lang w:val="es-MX"/>
+        </w:rPr>
+      </w:pPr>
+      <w:r>
+        <w:rPr>
+          <w:lang w:val="es-MX"/>
+        </w:rPr>
+        <w:t xml:space="preserve">  │ Pao Jimenez            │ INAT-10081285                │ aprobada  │ Migrado iNaturalist       │</w:t>
+      </w:r>
+    </w:p>
+    <w:p>
+      <w:pPr>
+        <w:rPr>
+          <w:lang w:val="es-MX"/>
+        </w:rPr>
+      </w:pPr>
+      <w:r>
+        <w:rPr>
+          <w:lang w:val="es-MX"/>
+        </w:rPr>
+        <w:t xml:space="preserve">  </w:t>
+      </w:r>
+      <w:r>
+        <w:rPr>
+          <w:rFonts w:ascii="MS Gothic" w:eastAsia="MS Gothic" w:hAnsi="MS Gothic" w:cs="MS Gothic" w:hint="eastAsia"/>
+          <w:lang w:val="es-MX"/>
+        </w:rPr>
+        <w:t>├</w:t>
+      </w:r>
+      <w:r>
+        <w:rPr>
+          <w:lang w:val="es-MX"/>
+        </w:rPr>
+        <w:t>────────────────────────</w:t>
+      </w:r>
+      <w:r>
+        <w:rPr>
+          <w:rFonts w:ascii="MS Gothic" w:eastAsia="MS Gothic" w:hAnsi="MS Gothic" w:cs="MS Gothic" w:hint="eastAsia"/>
+          <w:lang w:val="es-MX"/>
+        </w:rPr>
+        <w:t>┼</w:t>
+      </w:r>
+      <w:r>
+        <w:rPr>
+          <w:lang w:val="es-MX"/>
+        </w:rPr>
+        <w:t>──────────────────────────────</w:t>
+      </w:r>
+      <w:r>
+        <w:rPr>
+          <w:rFonts w:ascii="MS Gothic" w:eastAsia="MS Gothic" w:hAnsi="MS Gothic" w:cs="MS Gothic" w:hint="eastAsia"/>
+          <w:lang w:val="es-MX"/>
+        </w:rPr>
+        <w:t>┼</w:t>
+      </w:r>
+      <w:r>
+        <w:rPr>
+          <w:lang w:val="es-MX"/>
+        </w:rPr>
+        <w:t>───────────</w:t>
+      </w:r>
+      <w:r>
+        <w:rPr>
+          <w:rFonts w:ascii="MS Gothic" w:eastAsia="MS Gothic" w:hAnsi="MS Gothic" w:cs="MS Gothic" w:hint="eastAsia"/>
+          <w:lang w:val="es-MX"/>
+        </w:rPr>
+        <w:t>┼</w:t>
+      </w:r>
+      <w:r>
+        <w:rPr>
+          <w:lang w:val="es-MX"/>
+        </w:rPr>
+        <w:t>───────────────────────────</w:t>
+      </w:r>
+      <w:r>
+        <w:rPr>
+          <w:rFonts w:ascii="MS Gothic" w:eastAsia="MS Gothic" w:hAnsi="MS Gothic" w:cs="MS Gothic" w:hint="eastAsia"/>
+          <w:lang w:val="es-MX"/>
+        </w:rPr>
+        <w:t>┤</w:t>
+      </w:r>
+    </w:p>
+    <w:p>
+      <w:pPr>
+        <w:rPr>
+          <w:lang w:val="es-MX"/>
+        </w:rPr>
+      </w:pPr>
+      <w:r>
+        <w:rPr>
+          <w:lang w:val="es-MX"/>
+        </w:rPr>
+        <w:t xml:space="preserve">  │ Thali Valencia         │ INAT-10136599                │ aprobada  │ Migrado iNaturalist       │</w:t>
+      </w:r>
+    </w:p>
+    <w:p>
+      <w:pPr>
+        <w:rPr>
+          <w:lang w:val="es-MX"/>
+        </w:rPr>
+      </w:pPr>
+      <w:r>
+        <w:rPr>
+          <w:lang w:val="es-MX"/>
+        </w:rPr>
+        <w:t xml:space="preserve">  </w:t>
+      </w:r>
+      <w:r>
+        <w:rPr>
+          <w:rFonts w:ascii="MS Gothic" w:eastAsia="MS Gothic" w:hAnsi="MS Gothic" w:cs="MS Gothic" w:hint="eastAsia"/>
+          <w:lang w:val="es-MX"/>
+        </w:rPr>
+        <w:t>├</w:t>
+      </w:r>
+      <w:r>
+        <w:rPr>
+          <w:lang w:val="es-MX"/>
+        </w:rPr>
+        <w:t>────────────────────────</w:t>
+      </w:r>
+      <w:r>
+        <w:rPr>
+          <w:rFonts w:ascii="MS Gothic" w:eastAsia="MS Gothic" w:hAnsi="MS Gothic" w:cs="MS Gothic" w:hint="eastAsia"/>
+          <w:lang w:val="es-MX"/>
+        </w:rPr>
+        <w:t>┼</w:t>
+      </w:r>
+      <w:r>
+        <w:rPr>
+          <w:lang w:val="es-MX"/>
+        </w:rPr>
+        <w:t>──────────────────────────────</w:t>
+      </w:r>
+      <w:r>
+        <w:rPr>
+          <w:rFonts w:ascii="MS Gothic" w:eastAsia="MS Gothic" w:hAnsi="MS Gothic" w:cs="MS Gothic" w:hint="eastAsia"/>
+          <w:lang w:val="es-MX"/>
+        </w:rPr>
+        <w:t>┼</w:t>
+      </w:r>
+      <w:r>
+        <w:rPr>
+          <w:lang w:val="es-MX"/>
+        </w:rPr>
+        <w:t>───────────</w:t>
+      </w:r>
+      <w:r>
+        <w:rPr>
+          <w:rFonts w:ascii="MS Gothic" w:eastAsia="MS Gothic" w:hAnsi="MS Gothic" w:cs="MS Gothic" w:hint="eastAsia"/>
+          <w:lang w:val="es-MX"/>
+        </w:rPr>
+        <w:t>┼</w:t>
+      </w:r>
+      <w:r>
+        <w:rPr>
+          <w:lang w:val="es-MX"/>
+        </w:rPr>
+        <w:t>───────────────────────────</w:t>
+      </w:r>
+      <w:r>
+        <w:rPr>
+          <w:rFonts w:ascii="MS Gothic" w:eastAsia="MS Gothic" w:hAnsi="MS Gothic" w:cs="MS Gothic" w:hint="eastAsia"/>
+          <w:lang w:val="es-MX"/>
+        </w:rPr>
+        <w:t>┤</w:t>
+      </w:r>
+    </w:p>
+    <w:p>
+      <w:pPr>
+        <w:rPr>
+          <w:lang w:val="es-MX"/>
+        </w:rPr>
+      </w:pPr>
+      <w:r>
+        <w:rPr>
+          <w:lang w:val="es-MX"/>
+        </w:rPr>
+        <w:t xml:space="preserve">  │ Isabel Ramos           │ INAT-10088806                │ aprobada  │ Migrado iNaturalist       │</w:t>
+      </w:r>
+    </w:p>
+    <w:p>
+      <w:pPr>
+        <w:rPr>
+          <w:lang w:val="es-MX"/>
+        </w:rPr>
+      </w:pPr>
+      <w:r>
+        <w:rPr>
+          <w:lang w:val="es-MX"/>
+        </w:rPr>
+        <w:t xml:space="preserve">  </w:t>
+      </w:r>
+      <w:r>
+        <w:rPr>
+          <w:rFonts w:ascii="MS Gothic" w:eastAsia="MS Gothic" w:hAnsi="MS Gothic" w:cs="MS Gothic" w:hint="eastAsia"/>
+          <w:lang w:val="es-MX"/>
+        </w:rPr>
+        <w:t>├</w:t>
+      </w:r>
+      <w:r>
+        <w:rPr>
+          <w:lang w:val="es-MX"/>
+        </w:rPr>
+        <w:t>────────────────────────</w:t>
+      </w:r>
+      <w:r>
+        <w:rPr>
+          <w:rFonts w:ascii="MS Gothic" w:eastAsia="MS Gothic" w:hAnsi="MS Gothic" w:cs="MS Gothic" w:hint="eastAsia"/>
+          <w:lang w:val="es-MX"/>
+        </w:rPr>
+        <w:t>┼</w:t>
+      </w:r>
+      <w:r>
+        <w:rPr>
+          <w:lang w:val="es-MX"/>
+        </w:rPr>
+        <w:t>──────────────────────────────</w:t>
+      </w:r>
+      <w:r>
+        <w:rPr>
+          <w:rFonts w:ascii="MS Gothic" w:eastAsia="MS Gothic" w:hAnsi="MS Gothic" w:cs="MS Gothic" w:hint="eastAsia"/>
+          <w:lang w:val="es-MX"/>
+        </w:rPr>
+        <w:t>┼</w:t>
+      </w:r>
+      <w:r>
+        <w:rPr>
+          <w:lang w:val="es-MX"/>
+        </w:rPr>
+        <w:t>───────────</w:t>
+      </w:r>
+      <w:r>
+        <w:rPr>
+          <w:rFonts w:ascii="MS Gothic" w:eastAsia="MS Gothic" w:hAnsi="MS Gothic" w:cs="MS Gothic" w:hint="eastAsia"/>
+          <w:lang w:val="es-MX"/>
+        </w:rPr>
+        <w:t>┼</w:t>
+      </w:r>
+      <w:r>
+        <w:rPr>
+          <w:lang w:val="es-MX"/>
+        </w:rPr>
+        <w:t>───────────────────────────</w:t>
+      </w:r>
+      <w:r>
+        <w:rPr>
+          <w:rFonts w:ascii="MS Gothic" w:eastAsia="MS Gothic" w:hAnsi="MS Gothic" w:cs="MS Gothic" w:hint="eastAsia"/>
+          <w:lang w:val="es-MX"/>
+        </w:rPr>
+        <w:t>┤</w:t>
+      </w:r>
+    </w:p>
+    <w:p>
+      <w:pPr>
+        <w:rPr>
+          <w:lang w:val="es-MX"/>
+        </w:rPr>
+      </w:pPr>
+      <w:r>
+        <w:rPr>
+          <w:lang w:val="es-MX"/>
+        </w:rPr>
+        <w:t xml:space="preserve">  │ Ana Prueba             │ 1234567890                   │ aprobada  │ Prueba tuya anterior      │</w:t>
+      </w:r>
+    </w:p>
+    <w:p>
+      <w:pPr>
+        <w:rPr>
+          <w:lang w:val="es-MX"/>
+        </w:rPr>
+      </w:pPr>
+      <w:r>
+        <w:rPr>
+          <w:lang w:val="es-MX"/>
+        </w:rPr>
+        <w:t xml:space="preserve">  </w:t>
+      </w:r>
+      <w:r>
+        <w:rPr>
+          <w:rFonts w:ascii="MS Gothic" w:eastAsia="MS Gothic" w:hAnsi="MS Gothic" w:cs="MS Gothic" w:hint="eastAsia"/>
+          <w:lang w:val="es-MX"/>
+        </w:rPr>
+        <w:t>├</w:t>
+      </w:r>
+      <w:r>
+        <w:rPr>
+          <w:lang w:val="es-MX"/>
+        </w:rPr>
+        <w:t>────────────────────────</w:t>
+      </w:r>
+      <w:r>
+        <w:rPr>
+          <w:rFonts w:ascii="MS Gothic" w:eastAsia="MS Gothic" w:hAnsi="MS Gothic" w:cs="MS Gothic" w:hint="eastAsia"/>
+          <w:lang w:val="es-MX"/>
+        </w:rPr>
+        <w:t>┼</w:t>
+      </w:r>
+      <w:r>
+        <w:rPr>
+          <w:lang w:val="es-MX"/>
+        </w:rPr>
+        <w:t>──────────────────────────────</w:t>
+      </w:r>
+      <w:r>
+        <w:rPr>
+          <w:rFonts w:ascii="MS Gothic" w:eastAsia="MS Gothic" w:hAnsi="MS Gothic" w:cs="MS Gothic" w:hint="eastAsia"/>
+          <w:lang w:val="es-MX"/>
+        </w:rPr>
+        <w:t>┼</w:t>
+      </w:r>
+      <w:r>
+        <w:rPr>
+          <w:lang w:val="es-MX"/>
+        </w:rPr>
+        <w:t>───────────</w:t>
+      </w:r>
+      <w:r>
+        <w:rPr>
+          <w:rFonts w:ascii="MS Gothic" w:eastAsia="MS Gothic" w:hAnsi="MS Gothic" w:cs="MS Gothic" w:hint="eastAsia"/>
+          <w:lang w:val="es-MX"/>
+        </w:rPr>
+        <w:t>┼</w:t>
+      </w:r>
+      <w:r>
+        <w:rPr>
+          <w:lang w:val="es-MX"/>
+        </w:rPr>
+        <w:t>───────────────────────────</w:t>
+      </w:r>
+      <w:r>
+        <w:rPr>
+          <w:rFonts w:ascii="MS Gothic" w:eastAsia="MS Gothic" w:hAnsi="MS Gothic" w:cs="MS Gothic" w:hint="eastAsia"/>
+          <w:lang w:val="es-MX"/>
+        </w:rPr>
+        <w:t>┤</w:t>
+      </w:r>
+    </w:p>
+    <w:p>
+      <w:pPr>
+        <w:rPr>
+          <w:lang w:val="es-MX"/>
+        </w:rPr>
+      </w:pPr>
+      <w:r>
+        <w:rPr>
+          <w:lang w:val="es-MX"/>
+        </w:rPr>
+        <w:lastRenderedPageBreak/>
+        <w:t xml:space="preserve">  │ Flujo Nuevo            │ 5551234                      │ aprobada  │ Prueba tuya anterior      │</w:t>
+      </w:r>
+    </w:p>
+    <w:p>
+      <w:pPr>
+        <w:rPr>
+          <w:lang w:val="es-MX"/>
+        </w:rPr>
+      </w:pPr>
+      <w:r>
+        <w:rPr>
+          <w:lang w:val="es-MX"/>
+        </w:rPr>
+        <w:t xml:space="preserve">  </w:t>
+      </w:r>
+      <w:r>
+        <w:rPr>
+          <w:rFonts w:ascii="MS Gothic" w:eastAsia="MS Gothic" w:hAnsi="MS Gothic" w:cs="MS Gothic" w:hint="eastAsia"/>
+          <w:lang w:val="es-MX"/>
+        </w:rPr>
+        <w:t>├</w:t>
+      </w:r>
+      <w:r>
+        <w:rPr>
+          <w:lang w:val="es-MX"/>
+        </w:rPr>
+        <w:t>────────────────────────</w:t>
+      </w:r>
+      <w:r>
+        <w:rPr>
+          <w:rFonts w:ascii="MS Gothic" w:eastAsia="MS Gothic" w:hAnsi="MS Gothic" w:cs="MS Gothic" w:hint="eastAsia"/>
+          <w:lang w:val="es-MX"/>
+        </w:rPr>
+        <w:t>┼</w:t>
+      </w:r>
+      <w:r>
+        <w:rPr>
+          <w:lang w:val="es-MX"/>
+        </w:rPr>
+        <w:t>──────────────────────────────</w:t>
+      </w:r>
+      <w:r>
+        <w:rPr>
+          <w:rFonts w:ascii="MS Gothic" w:eastAsia="MS Gothic" w:hAnsi="MS Gothic" w:cs="MS Gothic" w:hint="eastAsia"/>
+          <w:lang w:val="es-MX"/>
+        </w:rPr>
+        <w:t>┼</w:t>
+      </w:r>
+      <w:r>
+        <w:rPr>
+          <w:lang w:val="es-MX"/>
+        </w:rPr>
+        <w:t>───────────</w:t>
+      </w:r>
+      <w:r>
+        <w:rPr>
+          <w:rFonts w:ascii="MS Gothic" w:eastAsia="MS Gothic" w:hAnsi="MS Gothic" w:cs="MS Gothic" w:hint="eastAsia"/>
+          <w:lang w:val="es-MX"/>
+        </w:rPr>
+        <w:t>┼</w:t>
+      </w:r>
+      <w:r>
+        <w:rPr>
+          <w:lang w:val="es-MX"/>
+        </w:rPr>
+        <w:t>───────────────────────────</w:t>
+      </w:r>
+      <w:r>
+        <w:rPr>
+          <w:rFonts w:ascii="MS Gothic" w:eastAsia="MS Gothic" w:hAnsi="MS Gothic" w:cs="MS Gothic" w:hint="eastAsia"/>
+          <w:lang w:val="es-MX"/>
+        </w:rPr>
+        <w:t>┤</w:t>
+      </w:r>
+    </w:p>
+    <w:p>
+      <w:pPr>
+        <w:rPr>
+          <w:lang w:val="es-MX"/>
+        </w:rPr>
+      </w:pPr>
+      <w:r>
+        <w:rPr>
+          <w:lang w:val="es-MX"/>
+        </w:rPr>
+        <w:t xml:space="preserve">  │ Sebas                  │ 1234                         │ pendiente │ Prueba tuya anterior      │</w:t>
+      </w:r>
+    </w:p>
+    <w:p>
+      <w:pPr>
+        <w:rPr>
+          <w:lang w:val="es-MX"/>
+        </w:rPr>
+      </w:pPr>
+      <w:r>
+        <w:rPr>
+          <w:lang w:val="es-MX"/>
+        </w:rPr>
+        <w:t xml:space="preserve">  </w:t>
+      </w:r>
+      <w:r>
+        <w:rPr>
+          <w:rFonts w:ascii="MS Gothic" w:eastAsia="MS Gothic" w:hAnsi="MS Gothic" w:cs="MS Gothic" w:hint="eastAsia"/>
+          <w:lang w:val="es-MX"/>
+        </w:rPr>
+        <w:t>├</w:t>
+      </w:r>
+      <w:r>
+        <w:rPr>
+          <w:lang w:val="es-MX"/>
+        </w:rPr>
+        <w:t>────────────────────────</w:t>
+      </w:r>
+      <w:r>
+        <w:rPr>
+          <w:rFonts w:ascii="MS Gothic" w:eastAsia="MS Gothic" w:hAnsi="MS Gothic" w:cs="MS Gothic" w:hint="eastAsia"/>
+          <w:lang w:val="es-MX"/>
+        </w:rPr>
+        <w:t>┼</w:t>
+      </w:r>
+      <w:r>
+        <w:rPr>
+          <w:lang w:val="es-MX"/>
+        </w:rPr>
+        <w:t>──────────────────────────────</w:t>
+      </w:r>
+      <w:r>
+        <w:rPr>
+          <w:rFonts w:ascii="MS Gothic" w:eastAsia="MS Gothic" w:hAnsi="MS Gothic" w:cs="MS Gothic" w:hint="eastAsia"/>
+          <w:lang w:val="es-MX"/>
+        </w:rPr>
+        <w:t>┼</w:t>
+      </w:r>
+      <w:r>
+        <w:rPr>
+          <w:lang w:val="es-MX"/>
+        </w:rPr>
+        <w:t>───────────</w:t>
+      </w:r>
+      <w:r>
+        <w:rPr>
+          <w:rFonts w:ascii="MS Gothic" w:eastAsia="MS Gothic" w:hAnsi="MS Gothic" w:cs="MS Gothic" w:hint="eastAsia"/>
+          <w:lang w:val="es-MX"/>
+        </w:rPr>
+        <w:t>┼</w:t>
+      </w:r>
+      <w:r>
+        <w:rPr>
+          <w:lang w:val="es-MX"/>
+        </w:rPr>
+        <w:t>───────────────────────────</w:t>
+      </w:r>
+      <w:r>
+        <w:rPr>
+          <w:rFonts w:ascii="MS Gothic" w:eastAsia="MS Gothic" w:hAnsi="MS Gothic" w:cs="MS Gothic" w:hint="eastAsia"/>
+          <w:lang w:val="es-MX"/>
+        </w:rPr>
+        <w:t>┤</w:t>
+      </w:r>
+    </w:p>
+    <w:p>
+      <w:pPr>
+        <w:rPr>
+          <w:lang w:val="es-MX"/>
+        </w:rPr>
+      </w:pPr>
+      <w:r>
+        <w:rPr>
+          <w:lang w:val="es-MX"/>
+        </w:rPr>
+        <w:t xml:space="preserve">  │ prueba1                │ 0001                         │ pendiente │ Prueba tuya anterior      │</w:t>
+      </w:r>
+    </w:p>
+    <w:p>
+      <w:pPr>
+        <w:rPr>
+          <w:lang w:val="es-MX"/>
+        </w:rPr>
+      </w:pPr>
+      <w:r>
+        <w:rPr>
+          <w:lang w:val="es-MX"/>
+        </w:rPr>
+        <w:t xml:space="preserve">  └────────────────────────</w:t>
+      </w:r>
+      <w:r>
+        <w:rPr>
+          <w:rFonts w:ascii="MS Gothic" w:eastAsia="MS Gothic" w:hAnsi="MS Gothic" w:cs="MS Gothic" w:hint="eastAsia"/>
+          <w:lang w:val="es-MX"/>
+        </w:rPr>
+        <w:t>┴</w:t>
+      </w:r>
+      <w:r>
+        <w:rPr>
+          <w:lang w:val="es-MX"/>
+        </w:rPr>
+        <w:t>──────────────────────────────</w:t>
+      </w:r>
+      <w:r>
+        <w:rPr>
+          <w:rFonts w:ascii="MS Gothic" w:eastAsia="MS Gothic" w:hAnsi="MS Gothic" w:cs="MS Gothic" w:hint="eastAsia"/>
+          <w:lang w:val="es-MX"/>
+        </w:rPr>
+        <w:t>┴</w:t>
+      </w:r>
+      <w:r>
+        <w:rPr>
+          <w:lang w:val="es-MX"/>
+        </w:rPr>
+        <w:t>───────────</w:t>
+      </w:r>
+      <w:r>
+        <w:rPr>
+          <w:rFonts w:ascii="MS Gothic" w:eastAsia="MS Gothic" w:hAnsi="MS Gothic" w:cs="MS Gothic" w:hint="eastAsia"/>
+          <w:lang w:val="es-MX"/>
+        </w:rPr>
+        <w:t>┴</w:t>
+      </w:r>
+      <w:r>
+        <w:rPr>
+          <w:lang w:val="es-MX"/>
+        </w:rPr>
+        <w:t>───────────────────────────┘</w:t>
+      </w:r>
+    </w:p>
+    <w:p>
+      <w:pPr>
+        <w:rPr>
+          <w:lang w:val="es-ES_tradnl"/>
+        </w:rPr>
+      </w:pPr>
     </w:p>
     <w:sectPr>
       <w:pgSz w:w="12240" w:h="15840"/>
@@ -1906,6 +3809,22 @@
       <w:shd w:val="clear" w:color="auto" w:fill="E1DFDD"/>
     </w:rPr>
   </w:style>
+  <w:style w:type="table" w:styleId="Tablaconcuadrcula">
+    <w:name w:val="Table Grid"/>
+    <w:basedOn w:val="Tablanormal"/>
+    <w:uiPriority w:val="39"/>
+    <w:rsid w:val="00F35E04"/>
+    <w:tblPr>
+      <w:tblBorders>
+        <w:top w:val="single" w:sz="4" w:space="0" w:color="auto"/>
+        <w:left w:val="single" w:sz="4" w:space="0" w:color="auto"/>
+        <w:bottom w:val="single" w:sz="4" w:space="0" w:color="auto"/>
+        <w:right w:val="single" w:sz="4" w:space="0" w:color="auto"/>
+        <w:insideH w:val="single" w:sz="4" w:space="0" w:color="auto"/>
+        <w:insideV w:val="single" w:sz="4" w:space="0" w:color="auto"/>
+      </w:tblBorders>
+    </w:tblPr>
+  </w:style>
 </w:styles>
 </file>
 

</xml_diff>